<commit_message>
Forms chapter going on
</commit_message>
<xml_diff>
--- a/Notes.docx
+++ b/Notes.docx
@@ -23,7 +23,7 @@
                     <pic:cNvPicPr/>
                   </pic:nvPicPr>
                   <pic:blipFill>
-                    <a:blip r:embed="rId4" cstate="print">
+                    <a:blip r:embed="rId5" cstate="print">
                       <a:extLst>
                         <a:ext uri="{28A0092B-C50C-407E-A947-70E740481C1C}">
                           <a14:useLocalDpi xmlns:a14="http://schemas.microsoft.com/office/drawing/2010/main" val="0"/>
@@ -72,7 +72,7 @@
                     <pic:cNvPicPr/>
                   </pic:nvPicPr>
                   <pic:blipFill>
-                    <a:blip r:embed="rId5" cstate="print">
+                    <a:blip r:embed="rId6" cstate="print">
                       <a:extLst>
                         <a:ext uri="{28A0092B-C50C-407E-A947-70E740481C1C}">
                           <a14:useLocalDpi xmlns:a14="http://schemas.microsoft.com/office/drawing/2010/main" val="0"/>
@@ -121,7 +121,7 @@
                     <pic:cNvPicPr/>
                   </pic:nvPicPr>
                   <pic:blipFill>
-                    <a:blip r:embed="rId6" cstate="print">
+                    <a:blip r:embed="rId7" cstate="print">
                       <a:extLst>
                         <a:ext uri="{28A0092B-C50C-407E-A947-70E740481C1C}">
                           <a14:useLocalDpi xmlns:a14="http://schemas.microsoft.com/office/drawing/2010/main" val="0"/>
@@ -180,39 +180,7 @@
           <w:sz w:val="28"/>
           <w:szCs w:val="28"/>
         </w:rPr>
-        <w:t>1.ordered list&lt;</w:t>
-      </w:r>
-      <w:proofErr w:type="spellStart"/>
-      <w:r>
-        <w:rPr>
-          <w:sz w:val="28"/>
-          <w:szCs w:val="28"/>
-        </w:rPr>
-        <w:t>ol</w:t>
-      </w:r>
-      <w:proofErr w:type="spellEnd"/>
-      <w:r>
-        <w:rPr>
-          <w:sz w:val="28"/>
-          <w:szCs w:val="28"/>
-        </w:rPr>
-        <w:t>&gt;&lt;/</w:t>
-      </w:r>
-      <w:proofErr w:type="spellStart"/>
-      <w:r>
-        <w:rPr>
-          <w:sz w:val="28"/>
-          <w:szCs w:val="28"/>
-        </w:rPr>
-        <w:t>ol</w:t>
-      </w:r>
-      <w:proofErr w:type="spellEnd"/>
-      <w:r>
-        <w:rPr>
-          <w:sz w:val="28"/>
-          <w:szCs w:val="28"/>
-        </w:rPr>
-        <w:t>&gt; this has numbered items</w:t>
+        <w:t>1.ordered list&lt;ol&gt;&lt;/ol&gt; this has numbered items</w:t>
       </w:r>
     </w:p>
     <w:p>
@@ -445,70 +413,22 @@
           <w:sz w:val="28"/>
           <w:szCs w:val="28"/>
         </w:rPr>
-        <w:t xml:space="preserve">sections based on their </w:t>
-      </w:r>
-      <w:proofErr w:type="spellStart"/>
-      <w:r>
-        <w:rPr>
-          <w:sz w:val="28"/>
-          <w:szCs w:val="28"/>
-        </w:rPr>
-        <w:t>iDs</w:t>
-      </w:r>
-      <w:proofErr w:type="spellEnd"/>
-      <w:r>
-        <w:rPr>
-          <w:sz w:val="28"/>
-          <w:szCs w:val="28"/>
-        </w:rPr>
-        <w:t xml:space="preserve">&lt;a </w:t>
-      </w:r>
-      <w:proofErr w:type="spellStart"/>
-      <w:r>
-        <w:rPr>
-          <w:sz w:val="28"/>
-          <w:szCs w:val="28"/>
-        </w:rPr>
-        <w:t>href</w:t>
-      </w:r>
-      <w:proofErr w:type="spellEnd"/>
-      <w:r>
-        <w:rPr>
-          <w:sz w:val="28"/>
-          <w:szCs w:val="28"/>
-        </w:rPr>
-        <w:t>=”#section ID”&gt;name&lt;/a&gt;</w:t>
-      </w:r>
-    </w:p>
-    <w:p>
-      <w:pPr>
-        <w:rPr>
-          <w:sz w:val="28"/>
-          <w:szCs w:val="28"/>
-        </w:rPr>
-      </w:pPr>
-      <w:r>
-        <w:rPr>
-          <w:sz w:val="28"/>
-          <w:szCs w:val="28"/>
-        </w:rPr>
-        <w:t xml:space="preserve">&lt;a </w:t>
-      </w:r>
-      <w:proofErr w:type="spellStart"/>
-      <w:r>
-        <w:rPr>
-          <w:sz w:val="28"/>
-          <w:szCs w:val="28"/>
-        </w:rPr>
-        <w:t>href</w:t>
-      </w:r>
-      <w:proofErr w:type="spellEnd"/>
-      <w:r>
-        <w:rPr>
-          <w:sz w:val="28"/>
-          <w:szCs w:val="28"/>
-        </w:rPr>
-        <w:t>=”#”&gt;back to top&lt;/a&gt;</w:t>
+        <w:t>sections based on their iDs&lt;a href=”#section ID”&gt;name&lt;/a&gt;</w:t>
+      </w:r>
+    </w:p>
+    <w:p>
+      <w:pPr>
+        <w:rPr>
+          <w:sz w:val="28"/>
+          <w:szCs w:val="28"/>
+        </w:rPr>
+      </w:pPr>
+      <w:r>
+        <w:rPr>
+          <w:sz w:val="28"/>
+          <w:szCs w:val="28"/>
+        </w:rPr>
+        <w:t>&lt;a href=”#”&gt;back to top&lt;/a&gt;</w:t>
       </w:r>
     </w:p>
     <w:p>
@@ -545,23 +465,7 @@
           <w:sz w:val="28"/>
           <w:szCs w:val="28"/>
         </w:rPr>
-        <w:t xml:space="preserve">&lt;a </w:t>
-      </w:r>
-      <w:proofErr w:type="spellStart"/>
-      <w:r>
-        <w:rPr>
-          <w:sz w:val="28"/>
-          <w:szCs w:val="28"/>
-        </w:rPr>
-        <w:t>href</w:t>
-      </w:r>
-      <w:proofErr w:type="spellEnd"/>
-      <w:r>
-        <w:rPr>
-          <w:sz w:val="28"/>
-          <w:szCs w:val="28"/>
-        </w:rPr>
-        <w:t>="/"&gt;Back to home&lt;/a&gt;</w:t>
+        <w:t>&lt;a href="/"&gt;Back to home&lt;/a&gt;</w:t>
       </w:r>
     </w:p>
     <w:p>
@@ -620,23 +524,7 @@
           <w:sz w:val="28"/>
           <w:szCs w:val="28"/>
         </w:rPr>
-        <w:t xml:space="preserve">Has multiple attributes like </w:t>
-      </w:r>
-      <w:proofErr w:type="spellStart"/>
-      <w:r>
-        <w:rPr>
-          <w:sz w:val="28"/>
-          <w:szCs w:val="28"/>
-        </w:rPr>
-        <w:t>scr</w:t>
-      </w:r>
-      <w:proofErr w:type="spellEnd"/>
-      <w:r>
-        <w:rPr>
-          <w:sz w:val="28"/>
-          <w:szCs w:val="28"/>
-        </w:rPr>
-        <w:t xml:space="preserve">: source, </w:t>
+        <w:t xml:space="preserve">Has multiple attributes like scr: source, </w:t>
       </w:r>
       <w:r>
         <w:rPr>
@@ -710,39 +598,7 @@
           <w:sz w:val="28"/>
           <w:szCs w:val="28"/>
         </w:rPr>
-        <w:t>&lt;</w:t>
-      </w:r>
-      <w:proofErr w:type="spellStart"/>
-      <w:r>
-        <w:rPr>
-          <w:sz w:val="28"/>
-          <w:szCs w:val="28"/>
-        </w:rPr>
-        <w:t>figcaption</w:t>
-      </w:r>
-      <w:proofErr w:type="spellEnd"/>
-      <w:r>
-        <w:rPr>
-          <w:sz w:val="28"/>
-          <w:szCs w:val="28"/>
-        </w:rPr>
-        <w:t>&gt;&lt;/</w:t>
-      </w:r>
-      <w:proofErr w:type="spellStart"/>
-      <w:r>
-        <w:rPr>
-          <w:sz w:val="28"/>
-          <w:szCs w:val="28"/>
-        </w:rPr>
-        <w:t>figcaption</w:t>
-      </w:r>
-      <w:proofErr w:type="spellEnd"/>
-      <w:r>
-        <w:rPr>
-          <w:sz w:val="28"/>
-          <w:szCs w:val="28"/>
-        </w:rPr>
-        <w:t>&gt;: gives the text below the image</w:t>
+        <w:t>&lt;figcaption&gt;&lt;/figcaption&gt;: gives the text below the image</w:t>
       </w:r>
       <w:r>
         <w:rPr>
@@ -941,21 +797,12 @@
         <w:lastRenderedPageBreak/>
         <w:t xml:space="preserve">&lt;article&gt;&lt;/article&gt;: used instead of sections </w:t>
       </w:r>
-      <w:proofErr w:type="spellStart"/>
-      <w:r>
-        <w:rPr>
-          <w:sz w:val="28"/>
-          <w:szCs w:val="28"/>
-        </w:rPr>
-        <w:t>bcuz</w:t>
-      </w:r>
-      <w:proofErr w:type="spellEnd"/>
-      <w:r>
-        <w:rPr>
-          <w:sz w:val="28"/>
-          <w:szCs w:val="28"/>
-        </w:rPr>
-        <w:t xml:space="preserve"> it has a clear topic whereas section is more generic</w:t>
+      <w:r>
+        <w:rPr>
+          <w:sz w:val="28"/>
+          <w:szCs w:val="28"/>
+        </w:rPr>
+        <w:t>bcuz it has a clear topic whereas section is more generic</w:t>
       </w:r>
     </w:p>
     <w:p>
@@ -1095,23 +942,7 @@
           <w:sz w:val="28"/>
           <w:szCs w:val="28"/>
         </w:rPr>
-        <w:t xml:space="preserve">&lt;div&gt;&lt;/div&gt; and &lt;span&gt;&lt;/span&gt;: avoid these tags </w:t>
-      </w:r>
-      <w:proofErr w:type="spellStart"/>
-      <w:r>
-        <w:rPr>
-          <w:sz w:val="28"/>
-          <w:szCs w:val="28"/>
-        </w:rPr>
-        <w:t>bcuz</w:t>
-      </w:r>
-      <w:proofErr w:type="spellEnd"/>
-      <w:r>
-        <w:rPr>
-          <w:sz w:val="28"/>
-          <w:szCs w:val="28"/>
-        </w:rPr>
-        <w:t xml:space="preserve"> they have no sematic meaning in html but r used in CSS </w:t>
+        <w:t xml:space="preserve">&lt;div&gt;&lt;/div&gt; and &lt;span&gt;&lt;/span&gt;: avoid these tags bcuz they have no sematic meaning in html but r used in CSS </w:t>
       </w:r>
     </w:p>
     <w:p>
@@ -1200,86 +1031,22 @@
           <w:sz w:val="28"/>
           <w:szCs w:val="28"/>
         </w:rPr>
-        <w:t>&lt;</w:t>
-      </w:r>
-      <w:proofErr w:type="spellStart"/>
-      <w:r>
-        <w:rPr>
-          <w:sz w:val="28"/>
-          <w:szCs w:val="28"/>
-        </w:rPr>
-        <w:t>th</w:t>
-      </w:r>
-      <w:proofErr w:type="spellEnd"/>
-      <w:r>
-        <w:rPr>
-          <w:sz w:val="28"/>
-          <w:szCs w:val="28"/>
-        </w:rPr>
-        <w:t>&gt;&lt;/</w:t>
-      </w:r>
-      <w:proofErr w:type="spellStart"/>
-      <w:r>
-        <w:rPr>
-          <w:sz w:val="28"/>
-          <w:szCs w:val="28"/>
-        </w:rPr>
-        <w:t>th</w:t>
-      </w:r>
-      <w:proofErr w:type="spellEnd"/>
-      <w:r>
-        <w:rPr>
-          <w:sz w:val="28"/>
-          <w:szCs w:val="28"/>
-        </w:rPr>
-        <w:t>&gt;: table header</w:t>
-      </w:r>
-    </w:p>
-    <w:p>
-      <w:pPr>
-        <w:rPr>
-          <w:sz w:val="28"/>
-          <w:szCs w:val="28"/>
-        </w:rPr>
-      </w:pPr>
-      <w:r>
-        <w:rPr>
-          <w:sz w:val="28"/>
-          <w:szCs w:val="28"/>
-        </w:rPr>
-        <w:t>&lt;</w:t>
-      </w:r>
-      <w:proofErr w:type="spellStart"/>
-      <w:r>
-        <w:rPr>
-          <w:sz w:val="28"/>
-          <w:szCs w:val="28"/>
-        </w:rPr>
-        <w:t>thead</w:t>
-      </w:r>
-      <w:proofErr w:type="spellEnd"/>
-      <w:r>
-        <w:rPr>
-          <w:sz w:val="28"/>
-          <w:szCs w:val="28"/>
-        </w:rPr>
-        <w:t>&gt;&lt;/</w:t>
-      </w:r>
-      <w:proofErr w:type="spellStart"/>
-      <w:r>
-        <w:rPr>
-          <w:sz w:val="28"/>
-          <w:szCs w:val="28"/>
-        </w:rPr>
-        <w:t>thead</w:t>
-      </w:r>
-      <w:proofErr w:type="spellEnd"/>
-      <w:r>
-        <w:rPr>
-          <w:sz w:val="28"/>
-          <w:szCs w:val="28"/>
-        </w:rPr>
-        <w:t>&gt;: table header section for sema</w:t>
+        <w:t>&lt;th&gt;&lt;/th&gt;: table header</w:t>
+      </w:r>
+    </w:p>
+    <w:p>
+      <w:pPr>
+        <w:rPr>
+          <w:sz w:val="28"/>
+          <w:szCs w:val="28"/>
+        </w:rPr>
+      </w:pPr>
+      <w:r>
+        <w:rPr>
+          <w:sz w:val="28"/>
+          <w:szCs w:val="28"/>
+        </w:rPr>
+        <w:t>&lt;thead&gt;&lt;/thead&gt;: table header section for sema</w:t>
       </w:r>
       <w:r>
         <w:rPr>
@@ -1338,39 +1105,7 @@
           <w:sz w:val="28"/>
           <w:szCs w:val="28"/>
         </w:rPr>
-        <w:t>&lt;</w:t>
-      </w:r>
-      <w:proofErr w:type="spellStart"/>
-      <w:r>
-        <w:rPr>
-          <w:sz w:val="28"/>
-          <w:szCs w:val="28"/>
-        </w:rPr>
-        <w:t>tbody</w:t>
-      </w:r>
-      <w:proofErr w:type="spellEnd"/>
-      <w:r>
-        <w:rPr>
-          <w:sz w:val="28"/>
-          <w:szCs w:val="28"/>
-        </w:rPr>
-        <w:t>&gt;&lt;/</w:t>
-      </w:r>
-      <w:proofErr w:type="spellStart"/>
-      <w:r>
-        <w:rPr>
-          <w:sz w:val="28"/>
-          <w:szCs w:val="28"/>
-        </w:rPr>
-        <w:t>tbody</w:t>
-      </w:r>
-      <w:proofErr w:type="spellEnd"/>
-      <w:r>
-        <w:rPr>
-          <w:sz w:val="28"/>
-          <w:szCs w:val="28"/>
-        </w:rPr>
-        <w:t>&gt;: table body section for semantics</w:t>
+        <w:t>&lt;tbody&gt;&lt;/tbody&gt;: table body section for semantics</w:t>
       </w:r>
       <w:r>
         <w:rPr>
@@ -1407,55 +1142,7 @@
           <w:sz w:val="28"/>
           <w:szCs w:val="28"/>
         </w:rPr>
-        <w:t>&lt;</w:t>
-      </w:r>
-      <w:proofErr w:type="spellStart"/>
-      <w:r>
-        <w:rPr>
-          <w:sz w:val="28"/>
-          <w:szCs w:val="28"/>
-        </w:rPr>
-        <w:t>th</w:t>
-      </w:r>
-      <w:proofErr w:type="spellEnd"/>
-      <w:r>
-        <w:rPr>
-          <w:sz w:val="28"/>
-          <w:szCs w:val="28"/>
-        </w:rPr>
-        <w:t>&gt;&amp;</w:t>
-      </w:r>
-      <w:proofErr w:type="spellStart"/>
-      <w:r>
-        <w:rPr>
-          <w:sz w:val="28"/>
-          <w:szCs w:val="28"/>
-        </w:rPr>
-        <w:t>nbsp</w:t>
-      </w:r>
-      <w:proofErr w:type="spellEnd"/>
-      <w:r>
-        <w:rPr>
-          <w:sz w:val="28"/>
-          <w:szCs w:val="28"/>
-        </w:rPr>
-        <w:t>;&lt;/</w:t>
-      </w:r>
-      <w:proofErr w:type="spellStart"/>
-      <w:r>
-        <w:rPr>
-          <w:sz w:val="28"/>
-          <w:szCs w:val="28"/>
-        </w:rPr>
-        <w:t>th</w:t>
-      </w:r>
-      <w:proofErr w:type="spellEnd"/>
-      <w:r>
-        <w:rPr>
-          <w:sz w:val="28"/>
-          <w:szCs w:val="28"/>
-        </w:rPr>
-        <w:t>&gt; the code in the tag is an html entity</w:t>
+        <w:t>&lt;th&gt;&amp;nbsp;&lt;/th&gt; the code in the tag is an html entity</w:t>
       </w:r>
     </w:p>
     <w:p>
@@ -1471,24 +1158,507 @@
           <w:szCs w:val="28"/>
         </w:rPr>
         <w:lastRenderedPageBreak/>
-        <w:t>We should give the &lt;</w:t>
-      </w:r>
-      <w:proofErr w:type="spellStart"/>
-      <w:r>
-        <w:rPr>
-          <w:sz w:val="28"/>
-          <w:szCs w:val="28"/>
-        </w:rPr>
-        <w:t>th</w:t>
-      </w:r>
-      <w:proofErr w:type="spellEnd"/>
-      <w:r>
-        <w:rPr>
-          <w:sz w:val="28"/>
-          <w:szCs w:val="28"/>
-        </w:rPr>
-        <w:t xml:space="preserve"> scope=”row/column”&gt; a scope for better semantics </w:t>
-      </w:r>
+        <w:t xml:space="preserve">We should give the &lt;th scope=”row/column”&gt; a scope for better semantics </w:t>
+      </w:r>
+    </w:p>
+    <w:p>
+      <w:pPr>
+        <w:rPr>
+          <w:sz w:val="28"/>
+          <w:szCs w:val="28"/>
+        </w:rPr>
+      </w:pPr>
+    </w:p>
+    <w:p>
+      <w:r>
+        <w:rPr>
+          <w:b/>
+          <w:bCs/>
+          <w:sz w:val="40"/>
+          <w:szCs w:val="40"/>
+        </w:rPr>
+        <w:t>Forms and inputs:</w:t>
+      </w:r>
+      <w:r>
+        <w:t xml:space="preserve"> </w:t>
+      </w:r>
+    </w:p>
+    <w:p>
+      <w:pPr>
+        <w:rPr>
+          <w:sz w:val="28"/>
+          <w:szCs w:val="28"/>
+        </w:rPr>
+      </w:pPr>
+      <w:r>
+        <w:rPr>
+          <w:sz w:val="28"/>
+          <w:szCs w:val="28"/>
+        </w:rPr>
+        <w:t>&lt;form action="https://httpbin.org/get" method="get"&gt;</w:t>
+      </w:r>
+      <w:r>
+        <w:rPr>
+          <w:sz w:val="28"/>
+          <w:szCs w:val="28"/>
+        </w:rPr>
+        <w:t>&lt;/form&gt;</w:t>
+      </w:r>
+    </w:p>
+    <w:p>
+      <w:pPr>
+        <w:rPr>
+          <w:sz w:val="28"/>
+          <w:szCs w:val="28"/>
+        </w:rPr>
+      </w:pPr>
+      <w:r>
+        <w:rPr>
+          <w:sz w:val="28"/>
+          <w:szCs w:val="28"/>
+        </w:rPr>
+        <w:t xml:space="preserve">: form tag with action and method </w:t>
+      </w:r>
+      <w:r>
+        <w:rPr>
+          <w:sz w:val="28"/>
+          <w:szCs w:val="28"/>
+        </w:rPr>
+        <w:t>attributes</w:t>
+      </w:r>
+    </w:p>
+    <w:p>
+      <w:pPr>
+        <w:rPr>
+          <w:sz w:val="28"/>
+          <w:szCs w:val="28"/>
+        </w:rPr>
+      </w:pPr>
+      <w:r>
+        <w:rPr>
+          <w:sz w:val="28"/>
+          <w:szCs w:val="28"/>
+        </w:rPr>
+        <w:t xml:space="preserve">&lt;fieldset&gt;&lt;/fieldset&gt;: used in forms for semantic meaning </w:t>
+      </w:r>
+    </w:p>
+    <w:p>
+      <w:pPr>
+        <w:rPr>
+          <w:sz w:val="28"/>
+          <w:szCs w:val="28"/>
+        </w:rPr>
+      </w:pPr>
+      <w:r>
+        <w:rPr>
+          <w:sz w:val="28"/>
+          <w:szCs w:val="28"/>
+        </w:rPr>
+        <w:t xml:space="preserve">&lt;legend&gt;&lt;/legend&gt;: </w:t>
+      </w:r>
+      <w:r>
+        <w:rPr>
+          <w:sz w:val="28"/>
+          <w:szCs w:val="28"/>
+        </w:rPr>
+        <w:t>creates a box around the field with text in between it as heading</w:t>
+      </w:r>
+    </w:p>
+    <w:p>
+      <w:pPr>
+        <w:rPr>
+          <w:sz w:val="28"/>
+          <w:szCs w:val="28"/>
+        </w:rPr>
+      </w:pPr>
+      <w:r>
+        <w:rPr>
+          <w:sz w:val="28"/>
+          <w:szCs w:val="28"/>
+        </w:rPr>
+        <w:t>&lt;label&gt;&lt;/label&gt;: used for labelling the input of form</w:t>
+      </w:r>
+    </w:p>
+    <w:p>
+      <w:pPr>
+        <w:rPr>
+          <w:sz w:val="28"/>
+          <w:szCs w:val="28"/>
+        </w:rPr>
+      </w:pPr>
+      <w:r>
+        <w:rPr>
+          <w:sz w:val="28"/>
+          <w:szCs w:val="28"/>
+        </w:rPr>
+        <w:t>&lt;input&gt;&lt;/input&gt;: tag used to take input it has</w:t>
+      </w:r>
+      <w:r>
+        <w:rPr>
+          <w:sz w:val="28"/>
+          <w:szCs w:val="28"/>
+        </w:rPr>
+        <w:t xml:space="preserve"> attributes such as:</w:t>
+      </w:r>
+    </w:p>
+    <w:p>
+      <w:pPr>
+        <w:pStyle w:val="ListParagraph"/>
+        <w:numPr>
+          <w:ilvl w:val="0"/>
+          <w:numId w:val="1"/>
+        </w:numPr>
+        <w:rPr>
+          <w:sz w:val="28"/>
+          <w:szCs w:val="28"/>
+        </w:rPr>
+      </w:pPr>
+      <w:r>
+        <w:rPr>
+          <w:sz w:val="28"/>
+          <w:szCs w:val="28"/>
+        </w:rPr>
+        <w:t>type</w:t>
+      </w:r>
+      <w:r>
+        <w:rPr>
+          <w:sz w:val="28"/>
+          <w:szCs w:val="28"/>
+        </w:rPr>
+        <w:t xml:space="preserve"> (text, password, tel, email, </w:t>
+      </w:r>
+      <w:r>
+        <w:rPr>
+          <w:sz w:val="28"/>
+          <w:szCs w:val="28"/>
+        </w:rPr>
+        <w:t>etc),</w:t>
+      </w:r>
+    </w:p>
+    <w:p>
+      <w:pPr>
+        <w:pStyle w:val="ListParagraph"/>
+        <w:numPr>
+          <w:ilvl w:val="0"/>
+          <w:numId w:val="1"/>
+        </w:numPr>
+        <w:rPr>
+          <w:sz w:val="28"/>
+          <w:szCs w:val="28"/>
+        </w:rPr>
+      </w:pPr>
+      <w:r>
+        <w:rPr>
+          <w:sz w:val="28"/>
+          <w:szCs w:val="28"/>
+        </w:rPr>
+        <w:t>number</w:t>
+      </w:r>
+      <w:r>
+        <w:rPr>
+          <w:sz w:val="28"/>
+          <w:szCs w:val="28"/>
+        </w:rPr>
+        <w:t xml:space="preserve"> </w:t>
+      </w:r>
+      <w:r>
+        <w:rPr>
+          <w:sz w:val="28"/>
+          <w:szCs w:val="28"/>
+        </w:rPr>
+        <w:t>(this type cannot have placeholder attribute use value instead)</w:t>
+      </w:r>
+      <w:r>
+        <w:rPr>
+          <w:sz w:val="28"/>
+          <w:szCs w:val="28"/>
+        </w:rPr>
+        <w:t xml:space="preserve">, </w:t>
+      </w:r>
+      <w:r>
+        <w:rPr>
+          <w:sz w:val="28"/>
+          <w:szCs w:val="28"/>
+        </w:rPr>
+        <w:t xml:space="preserve">name, </w:t>
+      </w:r>
+    </w:p>
+    <w:p>
+      <w:pPr>
+        <w:pStyle w:val="ListParagraph"/>
+        <w:numPr>
+          <w:ilvl w:val="0"/>
+          <w:numId w:val="1"/>
+        </w:numPr>
+        <w:rPr>
+          <w:sz w:val="28"/>
+          <w:szCs w:val="28"/>
+        </w:rPr>
+      </w:pPr>
+      <w:r>
+        <w:rPr>
+          <w:sz w:val="28"/>
+          <w:szCs w:val="28"/>
+        </w:rPr>
+        <w:t xml:space="preserve">id, </w:t>
+      </w:r>
+    </w:p>
+    <w:p>
+      <w:pPr>
+        <w:pStyle w:val="ListParagraph"/>
+        <w:numPr>
+          <w:ilvl w:val="0"/>
+          <w:numId w:val="1"/>
+        </w:numPr>
+        <w:rPr>
+          <w:sz w:val="28"/>
+          <w:szCs w:val="28"/>
+        </w:rPr>
+      </w:pPr>
+      <w:r>
+        <w:rPr>
+          <w:sz w:val="28"/>
+          <w:szCs w:val="28"/>
+        </w:rPr>
+        <w:t xml:space="preserve">autocomplete, </w:t>
+      </w:r>
+    </w:p>
+    <w:p>
+      <w:pPr>
+        <w:pStyle w:val="ListParagraph"/>
+        <w:numPr>
+          <w:ilvl w:val="0"/>
+          <w:numId w:val="1"/>
+        </w:numPr>
+        <w:rPr>
+          <w:sz w:val="28"/>
+          <w:szCs w:val="28"/>
+        </w:rPr>
+      </w:pPr>
+      <w:r>
+        <w:rPr>
+          <w:sz w:val="28"/>
+          <w:szCs w:val="28"/>
+        </w:rPr>
+        <w:t>autofocus</w:t>
+      </w:r>
+      <w:r>
+        <w:rPr>
+          <w:sz w:val="28"/>
+          <w:szCs w:val="28"/>
+        </w:rPr>
+        <w:t xml:space="preserve"> </w:t>
+      </w:r>
+      <w:r>
+        <w:rPr>
+          <w:sz w:val="28"/>
+          <w:szCs w:val="28"/>
+        </w:rPr>
+        <w:t>(there will be only one autofocus)</w:t>
+      </w:r>
+      <w:r>
+        <w:rPr>
+          <w:sz w:val="28"/>
+          <w:szCs w:val="28"/>
+        </w:rPr>
+        <w:t xml:space="preserve">, </w:t>
+      </w:r>
+    </w:p>
+    <w:p>
+      <w:pPr>
+        <w:pStyle w:val="ListParagraph"/>
+        <w:numPr>
+          <w:ilvl w:val="0"/>
+          <w:numId w:val="1"/>
+        </w:numPr>
+        <w:rPr>
+          <w:sz w:val="28"/>
+          <w:szCs w:val="28"/>
+        </w:rPr>
+      </w:pPr>
+      <w:r>
+        <w:rPr>
+          <w:sz w:val="28"/>
+          <w:szCs w:val="28"/>
+        </w:rPr>
+        <w:t xml:space="preserve">required, </w:t>
+      </w:r>
+    </w:p>
+    <w:p>
+      <w:pPr>
+        <w:pStyle w:val="ListParagraph"/>
+        <w:numPr>
+          <w:ilvl w:val="0"/>
+          <w:numId w:val="1"/>
+        </w:numPr>
+        <w:rPr>
+          <w:sz w:val="28"/>
+          <w:szCs w:val="28"/>
+        </w:rPr>
+      </w:pPr>
+      <w:r>
+        <w:rPr>
+          <w:sz w:val="28"/>
+          <w:szCs w:val="28"/>
+        </w:rPr>
+        <w:t xml:space="preserve">placeholder, </w:t>
+      </w:r>
+    </w:p>
+    <w:p>
+      <w:pPr>
+        <w:pStyle w:val="ListParagraph"/>
+        <w:numPr>
+          <w:ilvl w:val="0"/>
+          <w:numId w:val="1"/>
+        </w:numPr>
+        <w:rPr>
+          <w:sz w:val="28"/>
+          <w:szCs w:val="28"/>
+        </w:rPr>
+      </w:pPr>
+      <w:r>
+        <w:rPr>
+          <w:sz w:val="28"/>
+          <w:szCs w:val="28"/>
+        </w:rPr>
+        <w:t xml:space="preserve">min, </w:t>
+      </w:r>
+    </w:p>
+    <w:p>
+      <w:pPr>
+        <w:pStyle w:val="ListParagraph"/>
+        <w:numPr>
+          <w:ilvl w:val="0"/>
+          <w:numId w:val="1"/>
+        </w:numPr>
+        <w:rPr>
+          <w:sz w:val="28"/>
+          <w:szCs w:val="28"/>
+        </w:rPr>
+      </w:pPr>
+      <w:r>
+        <w:rPr>
+          <w:sz w:val="28"/>
+          <w:szCs w:val="28"/>
+        </w:rPr>
+        <w:t xml:space="preserve">max, </w:t>
+      </w:r>
+    </w:p>
+    <w:p>
+      <w:pPr>
+        <w:pStyle w:val="ListParagraph"/>
+        <w:numPr>
+          <w:ilvl w:val="0"/>
+          <w:numId w:val="1"/>
+        </w:numPr>
+        <w:rPr>
+          <w:sz w:val="28"/>
+          <w:szCs w:val="28"/>
+        </w:rPr>
+      </w:pPr>
+      <w:r>
+        <w:rPr>
+          <w:sz w:val="28"/>
+          <w:szCs w:val="28"/>
+        </w:rPr>
+        <w:t xml:space="preserve">Value, </w:t>
+      </w:r>
+    </w:p>
+    <w:p>
+      <w:pPr>
+        <w:pStyle w:val="ListParagraph"/>
+        <w:numPr>
+          <w:ilvl w:val="0"/>
+          <w:numId w:val="1"/>
+        </w:numPr>
+        <w:rPr>
+          <w:sz w:val="28"/>
+          <w:szCs w:val="28"/>
+        </w:rPr>
+      </w:pPr>
+      <w:r>
+        <w:rPr>
+          <w:sz w:val="28"/>
+          <w:szCs w:val="28"/>
+        </w:rPr>
+        <w:t>set</w:t>
+      </w:r>
+      <w:r>
+        <w:rPr>
+          <w:sz w:val="28"/>
+          <w:szCs w:val="28"/>
+        </w:rPr>
+        <w:t xml:space="preserve">, </w:t>
+      </w:r>
+    </w:p>
+    <w:p>
+      <w:pPr>
+        <w:pStyle w:val="ListParagraph"/>
+        <w:numPr>
+          <w:ilvl w:val="0"/>
+          <w:numId w:val="1"/>
+        </w:numPr>
+        <w:rPr>
+          <w:sz w:val="28"/>
+          <w:szCs w:val="28"/>
+        </w:rPr>
+      </w:pPr>
+      <w:r>
+        <w:rPr>
+          <w:sz w:val="28"/>
+          <w:szCs w:val="28"/>
+        </w:rPr>
+        <w:t>pattern (regular expression)</w:t>
+      </w:r>
+      <w:r>
+        <w:rPr>
+          <w:sz w:val="28"/>
+          <w:szCs w:val="28"/>
+        </w:rPr>
+        <w:t xml:space="preserve"> </w:t>
+      </w:r>
+    </w:p>
+    <w:p>
+      <w:pPr>
+        <w:rPr>
+          <w:b/>
+          <w:bCs/>
+          <w:sz w:val="40"/>
+          <w:szCs w:val="40"/>
+        </w:rPr>
+      </w:pPr>
+    </w:p>
+    <w:p>
+      <w:pPr>
+        <w:rPr>
+          <w:sz w:val="28"/>
+          <w:szCs w:val="28"/>
+        </w:rPr>
+      </w:pPr>
+    </w:p>
+    <w:p>
+      <w:pPr>
+        <w:rPr>
+          <w:sz w:val="28"/>
+          <w:szCs w:val="28"/>
+        </w:rPr>
+      </w:pPr>
+    </w:p>
+    <w:p>
+      <w:pPr>
+        <w:rPr>
+          <w:sz w:val="28"/>
+          <w:szCs w:val="28"/>
+        </w:rPr>
+      </w:pPr>
+    </w:p>
+    <w:p>
+      <w:pPr>
+        <w:rPr>
+          <w:sz w:val="28"/>
+          <w:szCs w:val="28"/>
+        </w:rPr>
+      </w:pPr>
     </w:p>
     <w:p>
       <w:pPr>
@@ -1514,6 +1684,127 @@
     </w:sectPr>
   </w:body>
 </w:document>
+</file>
+
+<file path=word/numbering.xml><?xml version="1.0" encoding="utf-8"?>
+<w:numbering xmlns:wpc="http://schemas.microsoft.com/office/word/2010/wordprocessingCanvas" xmlns:cx="http://schemas.microsoft.com/office/drawing/2014/chartex" xmlns:cx1="http://schemas.microsoft.com/office/drawing/2015/9/8/chartex" xmlns:cx2="http://schemas.microsoft.com/office/drawing/2015/10/21/chartex" xmlns:cx3="http://schemas.microsoft.com/office/drawing/2016/5/9/chartex" xmlns:cx4="http://schemas.microsoft.com/office/drawing/2016/5/10/chartex" xmlns:cx5="http://schemas.microsoft.com/office/drawing/2016/5/11/chartex" xmlns:cx6="http://schemas.microsoft.com/office/drawing/2016/5/12/chartex" xmlns:cx7="http://schemas.microsoft.com/office/drawing/2016/5/13/chartex" xmlns:cx8="http://schemas.microsoft.com/office/drawing/2016/5/14/chartex" xmlns:mc="http://schemas.openxmlformats.org/markup-compatibility/2006" xmlns:aink="http://schemas.microsoft.com/office/drawing/2016/ink" xmlns:am3d="http://schemas.microsoft.com/office/drawing/2017/model3d" xmlns:o="urn:schemas-microsoft-com:office:office" xmlns:oel="http://schemas.microsoft.com/office/2019/extlst" xmlns:r="http://schemas.openxmlformats.org/officeDocument/2006/relationships" xmlns:m="http://schemas.openxmlformats.org/officeDocument/2006/math" xmlns:v="urn:schemas-microsoft-com:vml" xmlns:wp14="http://schemas.microsoft.com/office/word/2010/wordprocessingDrawing" xmlns:wp="http://schemas.openxmlformats.org/drawingml/2006/wordprocessingDrawing" xmlns:w10="urn:schemas-microsoft-com:office:word" xmlns:w="http://schemas.openxmlformats.org/wordprocessingml/2006/main" xmlns:w14="http://schemas.microsoft.com/office/word/2010/wordml" xmlns:w15="http://schemas.microsoft.com/office/word/2012/wordml" xmlns:w16cex="http://schemas.microsoft.com/office/word/2018/wordml/cex" xmlns:w16cid="http://schemas.microsoft.com/office/word/2016/wordml/cid" xmlns:w16="http://schemas.microsoft.com/office/word/2018/wordml" xmlns:w16du="http://schemas.microsoft.com/office/word/2023/wordml/word16du" xmlns:w16sdtdh="http://schemas.microsoft.com/office/word/2020/wordml/sdtdatahash" xmlns:w16sdtfl="http://schemas.microsoft.com/office/word/2024/wordml/sdtformatlock" xmlns:w16se="http://schemas.microsoft.com/office/word/2015/wordml/symex" xmlns:wpg="http://schemas.microsoft.com/office/word/2010/wordprocessingGroup" xmlns:wpi="http://schemas.microsoft.com/office/word/2010/wordprocessingInk" xmlns:wne="http://schemas.microsoft.com/office/word/2006/wordml" xmlns:wps="http://schemas.microsoft.com/office/word/2010/wordprocessingShape" mc:Ignorable="w14 w15 w16se w16cid w16 w16cex w16sdtdh w16sdtfl w16du wp14">
+  <w:abstractNum w:abstractNumId="0" w15:restartNumberingAfterBreak="0">
+    <w:nsid w:val="125D2F8B"/>
+    <w:multiLevelType w:val="hybridMultilevel"/>
+    <w:tmpl w:val="64EAD0FC"/>
+    <w:lvl w:ilvl="0" w:tplc="40090001">
+      <w:start w:val="1"/>
+      <w:numFmt w:val="bullet"/>
+      <w:lvlText w:val=""/>
+      <w:lvlJc w:val="left"/>
+      <w:pPr>
+        <w:ind w:left="720" w:hanging="360"/>
+      </w:pPr>
+      <w:rPr>
+        <w:rFonts w:ascii="Symbol" w:hAnsi="Symbol" w:hint="default"/>
+      </w:rPr>
+    </w:lvl>
+    <w:lvl w:ilvl="1" w:tplc="40090003" w:tentative="1">
+      <w:start w:val="1"/>
+      <w:numFmt w:val="bullet"/>
+      <w:lvlText w:val="o"/>
+      <w:lvlJc w:val="left"/>
+      <w:pPr>
+        <w:ind w:left="1440" w:hanging="360"/>
+      </w:pPr>
+      <w:rPr>
+        <w:rFonts w:ascii="Courier New" w:hAnsi="Courier New" w:cs="Courier New" w:hint="default"/>
+      </w:rPr>
+    </w:lvl>
+    <w:lvl w:ilvl="2" w:tplc="40090005" w:tentative="1">
+      <w:start w:val="1"/>
+      <w:numFmt w:val="bullet"/>
+      <w:lvlText w:val=""/>
+      <w:lvlJc w:val="left"/>
+      <w:pPr>
+        <w:ind w:left="2160" w:hanging="360"/>
+      </w:pPr>
+      <w:rPr>
+        <w:rFonts w:ascii="Wingdings" w:hAnsi="Wingdings" w:hint="default"/>
+      </w:rPr>
+    </w:lvl>
+    <w:lvl w:ilvl="3" w:tplc="40090001" w:tentative="1">
+      <w:start w:val="1"/>
+      <w:numFmt w:val="bullet"/>
+      <w:lvlText w:val=""/>
+      <w:lvlJc w:val="left"/>
+      <w:pPr>
+        <w:ind w:left="2880" w:hanging="360"/>
+      </w:pPr>
+      <w:rPr>
+        <w:rFonts w:ascii="Symbol" w:hAnsi="Symbol" w:hint="default"/>
+      </w:rPr>
+    </w:lvl>
+    <w:lvl w:ilvl="4" w:tplc="40090003" w:tentative="1">
+      <w:start w:val="1"/>
+      <w:numFmt w:val="bullet"/>
+      <w:lvlText w:val="o"/>
+      <w:lvlJc w:val="left"/>
+      <w:pPr>
+        <w:ind w:left="3600" w:hanging="360"/>
+      </w:pPr>
+      <w:rPr>
+        <w:rFonts w:ascii="Courier New" w:hAnsi="Courier New" w:cs="Courier New" w:hint="default"/>
+      </w:rPr>
+    </w:lvl>
+    <w:lvl w:ilvl="5" w:tplc="40090005" w:tentative="1">
+      <w:start w:val="1"/>
+      <w:numFmt w:val="bullet"/>
+      <w:lvlText w:val=""/>
+      <w:lvlJc w:val="left"/>
+      <w:pPr>
+        <w:ind w:left="4320" w:hanging="360"/>
+      </w:pPr>
+      <w:rPr>
+        <w:rFonts w:ascii="Wingdings" w:hAnsi="Wingdings" w:hint="default"/>
+      </w:rPr>
+    </w:lvl>
+    <w:lvl w:ilvl="6" w:tplc="40090001" w:tentative="1">
+      <w:start w:val="1"/>
+      <w:numFmt w:val="bullet"/>
+      <w:lvlText w:val=""/>
+      <w:lvlJc w:val="left"/>
+      <w:pPr>
+        <w:ind w:left="5040" w:hanging="360"/>
+      </w:pPr>
+      <w:rPr>
+        <w:rFonts w:ascii="Symbol" w:hAnsi="Symbol" w:hint="default"/>
+      </w:rPr>
+    </w:lvl>
+    <w:lvl w:ilvl="7" w:tplc="40090003" w:tentative="1">
+      <w:start w:val="1"/>
+      <w:numFmt w:val="bullet"/>
+      <w:lvlText w:val="o"/>
+      <w:lvlJc w:val="left"/>
+      <w:pPr>
+        <w:ind w:left="5760" w:hanging="360"/>
+      </w:pPr>
+      <w:rPr>
+        <w:rFonts w:ascii="Courier New" w:hAnsi="Courier New" w:cs="Courier New" w:hint="default"/>
+      </w:rPr>
+    </w:lvl>
+    <w:lvl w:ilvl="8" w:tplc="40090005" w:tentative="1">
+      <w:start w:val="1"/>
+      <w:numFmt w:val="bullet"/>
+      <w:lvlText w:val=""/>
+      <w:lvlJc w:val="left"/>
+      <w:pPr>
+        <w:ind w:left="6480" w:hanging="360"/>
+      </w:pPr>
+      <w:rPr>
+        <w:rFonts w:ascii="Wingdings" w:hAnsi="Wingdings" w:hint="default"/>
+      </w:rPr>
+    </w:lvl>
+  </w:abstractNum>
+  <w:num w:numId="1" w16cid:durableId="1366711922">
+    <w:abstractNumId w:val="0"/>
+  </w:num>
+</w:numbering>
 </file>
 
 <file path=word/styles.xml><?xml version="1.0" encoding="utf-8"?>

</xml_diff>